<commit_message>
B1 2H: calendario por dias (Angie lun-mie + vie alternos desde 3-oct, Cristian mar-jue + vie alternos desde 10-oct), segunda clase seguida = consolidacion, cada clase estrena Frase del Dia; instrucciones, Cl 1 y Cl 2 alineadas
Co-Authored-By: Claude Fable 5.1 <noreply@anthropic.com>
</commit_message>
<xml_diff>
--- a/VERSION_2/B1_2H/INSTRUCCIONES_DOCENTES_B1_2H.docx
+++ b/VERSION_2/B1_2H/INSTRUCCIONES_DOCENTES_B1_2H.docx
@@ -51,7 +51,7 @@
           <w:b w:val="0"/>
           <w:sz w:val="20"/>
         </w:rPr>
-        <w:t>Es el mismo nivel B1 Mastery del cohorte de la mañana, pero en 2 horas diarias. En vez de dos clases el mismo día, las pistas se alternan por día:</w:t>
+        <w:t>Es el mismo nivel B1 Mastery del cohorte de la mañana, pero en 2 horas diarias. En vez de dos clases el mismo día, las pistas se reparten por día de la semana:</w:t>
       </w:r>
     </w:p>
     <w:tbl>
@@ -191,7 +191,7 @@
               <w:rPr>
                 <w:sz w:val="19"/>
               </w:rPr>
-              <w:t>Impares: 1, 3, 5…</w:t>
+              <w:t>Lunes y miércoles, y viernes alternos (empieza el viernes 3 de octubre)</w:t>
             </w:r>
           </w:p>
         </w:tc>
@@ -259,7 +259,7 @@
               <w:rPr>
                 <w:sz w:val="19"/>
               </w:rPr>
-              <w:t>Pares: 2, 4, 6…</w:t>
+              <w:t>Martes y jueves, y viernes alternos (empieza el viernes 10 de octubre)</w:t>
             </w:r>
           </w:p>
         </w:tc>
@@ -291,6 +291,18 @@
           <w:sz w:val="20"/>
         </w:rPr>
         <w:t>Hoy, Clase 1, abre Conversación. Mañana, Clase 2, Gramática. Cada docente recibe únicamente la guía de su día.</w:t>
+      </w:r>
+    </w:p>
+    <w:p>
+      <w:pPr>
+        <w:spacing w:after="60"/>
+      </w:pPr>
+      <w:r>
+        <w:rPr>
+          <w:b w:val="0"/>
+          <w:sz w:val="20"/>
+        </w:rPr>
+        <w:t>Cuando un mismo docente dicta dos clases seguidas (viernes y lunes de Angie; jueves y viernes de Cristian), la segunda es de CONSOLIDACIÓN de su pista: en Conversación, producción extendida y simulación larga; en Gramática, taller de precisión y escritura. Ahí es donde caen los hitos del nivel (entrevistas simuladas, taller de pitch). La guía del día lo trae resuelto; el docente no tiene que decidirlo.</w:t>
       </w:r>
     </w:p>
     <w:p>
@@ -645,7 +657,7 @@
           <w:b w:val="0"/>
           <w:sz w:val="20"/>
         </w:rPr>
-        <w:t>Frase del Día en el tablero antes de empezar (la misma para los dos docentes del mismo día). Cuatro bloques largos. Cero material impreso preparado: todo en tablero o dictado. Simulación profesional con un guest, observadores con tarea y el docente como coach (nunca como guest). Tarea con hora de entrega: siempre antes de las 6:30 PM del día siguiente. Sin nombres de estudiantes en la guía; sin nombres de metodologías frente a los estudiantes.</w:t>
+        <w:t>Frase del Día en el tablero antes de empezar (cada clase estrena la suya; la de ayer va en el PASE como referencia). Cuatro bloques largos. Cero material impreso preparado: todo en tablero o dictado. Simulación profesional con un guest, observadores con tarea y el docente como coach (nunca como guest). Tarea con hora de entrega: siempre antes de las 6:30 PM del día siguiente. Sin nombres de estudiantes en la guía; sin nombres de metodologías frente a los estudiantes.</w:t>
       </w:r>
     </w:p>
     <w:p>

</xml_diff>

<commit_message>
B1 2H: el docente VE cada video y anota una mejora; feedback diario del docente vs notas solo por coordinacion; reporte en la plataforma al terminar la clase; seccion de virtudes en las instrucciones
Co-Authored-By: Claude Fable 5.1 <noreply@anthropic.com>
</commit_message>
<xml_diff>
--- a/VERSION_2/B1_2H/INSTRUCCIONES_DOCENTES_B1_2H.docx
+++ b/VERSION_2/B1_2H/INSTRUCCIONES_DOCENTES_B1_2H.docx
@@ -423,7 +423,7 @@
         <w:rPr>
           <w:sz w:val="20"/>
         </w:rPr>
-        <w:t>cada estudiante graba un video de mínimo 3 minutos, hablado de corrido y sin leer, y lo envía el mismo día al canal del cohorte. Ya no es audio y ya no se queda en el celular. Audio solo por excepción, máximo 2 por semana. El docente del día revisa al inicio quién lo ENVIÓ (no quién "lo hizo") y lo marca en el reporte.</w:t>
+        <w:t>cada estudiante graba un video de mínimo 3 minutos, hablado de corrido y sin leer, y lo envía el mismo día al canal del cohorte. Ya no es audio y ya no se queda en el celular. Audio solo por excepción, máximo 2 por semana. El docente del día VE los videos antes de la clase y anota al menos UNA cosa por mejorar de cada uno (una frase, con el error real). Al inicio de la clase, con la lista en mano, marca quién ENVIÓ y le dice a cada uno su mejora en voz alta, en 5 segundos. Video recibido + mejora anotada van al reporte de la noche. Es la revisión más importante del día: el video es la clase particular de cada estudiante.</w:t>
       </w:r>
     </w:p>
     <w:p>
@@ -493,13 +493,13 @@
           <w:b/>
           <w:sz w:val="20"/>
         </w:rPr>
-        <w:t xml:space="preserve">• Nada de notas ni resultados a los estudiantes: </w:t>
+        <w:t xml:space="preserve">• Feedback sí, notas no: </w:t>
       </w:r>
       <w:r>
         <w:rPr>
           <w:sz w:val="20"/>
         </w:rPr>
-        <w:t>toda pregunta de evaluación se responde "coordinación". El docente enseña; coordinación evalúa y comunica.</w:t>
+        <w:t>el docente da feedback TODOS los días y de frente: la mejora de cada video, el error paper, la corrección en la simulación, "esto te salió, esto te falta". Eso es lo que el estudiante más valora y es tuyo. Lo único que el docente NO comunica son NOTAS y RESULTADOS de las evaluaciones (midterm, final, aprobó o no, garantía): eso lo comunica coordinación, para que nadie negocie una nota con su profesor. Si preguntan "¿cómo voy?", se responde con feedback concreto; si preguntan "¿qué nota saqué?", se responde "eso te lo dice coordinación".</w:t>
       </w:r>
     </w:p>
     <w:p>
@@ -512,7 +512,19 @@
           <w:color w:val="E54C09"/>
           <w:sz w:val="23"/>
         </w:rPr>
-        <w:t>4. EL REPORTE DE CADA NOCHE (a coordinación, antes de dormir)</w:t>
+        <w:t>4. EL REPORTE DE CADA CLASE (en la plataforma, al terminar la clase)</w:t>
+      </w:r>
+    </w:p>
+    <w:p>
+      <w:pPr>
+        <w:spacing w:after="60"/>
+      </w:pPr>
+      <w:r>
+        <w:rPr>
+          <w:b w:val="0"/>
+          <w:sz w:val="20"/>
+        </w:rPr>
+        <w:t>Se llena en la plataforma de reportes de la academia la misma noche, al salir de la clase, con estas cinco piezas:</w:t>
       </w:r>
     </w:p>
     <w:p>
@@ -550,7 +562,7 @@
         <w:rPr>
           <w:sz w:val="20"/>
         </w:rPr>
-        <w:t>del día anterior: quién envió y quién no.</w:t>
+        <w:t>del día anterior: quién envió, quién no, y la mejora anotada por cada video visto.</w:t>
       </w:r>
     </w:p>
     <w:p>
@@ -645,7 +657,7 @@
           <w:color w:val="E54C09"/>
           <w:sz w:val="23"/>
         </w:rPr>
-        <w:t>6. LO QUE NO CAMBIA</w:t>
+        <w:t>6. LAS VIRTUDES: LO QUE HACE QUE ESTO SEA HEIIU Y NO UN CURSO DE INGLÉS</w:t>
       </w:r>
     </w:p>
     <w:p>
@@ -657,7 +669,32 @@
           <w:b w:val="0"/>
           <w:sz w:val="20"/>
         </w:rPr>
-        <w:t>Frase del Día en el tablero antes de empezar (cada clase estrena la suya; la de ayer va en el PASE como referencia). Cuatro bloques largos. Cero material impreso preparado: todo en tablero o dictado. Simulación profesional con un guest, observadores con tarea y el docente como coach (nunca como guest). Tarea con hora de entrega: siempre antes de las 6:30 PM del día siguiente. Sin nombres de estudiantes en la guía; sin nombres de metodologías frente a los estudiantes.</w:t>
+        <w:t>Cada bloque de 5 clases trabaja una de las cuatro virtudes cardinales, por calendario absoluto (Cl 1-5 Prudencia; la guía del día dice cuál sigue): PRUDENCIA (pensar antes de actuar, planear, decidir), FORTALEZA (coraje para hablar, iniciativa, no rendirse), TEMPLANZA (disciplina, manejo del tiempo, paciencia) y JUSTICIA (trabajo en equipo, liderazgo ético, empatía). La virtud no es un adorno: es el hilo del que cuelga la clase. La Frase del Día la lleva dentro, el ritual VATS de 5 a 7 minutos al inicio la activa (Virtud, Activar, Hablar, Compartir: una pregunta que junta la virtud con la gramática del día), y la simulación la pone a prueba. Por eso vendemos "inglés y carácter": puntualidad, constancia, decir la verdad, terminar lo que se empieza. Un estudiante que sale de aquí hablando inglés pero sin haber entrenado eso, no recibió el programa completo. El docente la nombra, la usa y la exige, todos los días, sin sermón: en una frase y en lo que pide.</w:t>
+      </w:r>
+    </w:p>
+    <w:p>
+      <w:pPr>
+        <w:spacing w:before="160" w:after="40"/>
+      </w:pPr>
+      <w:r>
+        <w:rPr>
+          <w:b/>
+          <w:color w:val="E54C09"/>
+          <w:sz w:val="23"/>
+        </w:rPr>
+        <w:t>7. LO QUE NO CAMBIA</w:t>
+      </w:r>
+    </w:p>
+    <w:p>
+      <w:pPr>
+        <w:spacing w:after="60"/>
+      </w:pPr>
+      <w:r>
+        <w:rPr>
+          <w:b w:val="0"/>
+          <w:sz w:val="20"/>
+        </w:rPr>
+        <w:t>Frase del Día en el tablero antes de empezar (cada clase estrena la suya; la de ayer va en el PASE como referencia). Feedback diario del docente; notas y resultados solo por coordinación. Cuatro bloques largos. Cero material impreso preparado: todo en tablero o dictado. Simulación profesional con un guest, observadores con tarea y el docente como coach (nunca como guest). Tarea con hora de entrega: siempre antes de las 6:30 PM del día siguiente. Sin nombres de estudiantes en la guía; sin nombres de metodologías frente a los estudiantes.</w:t>
       </w:r>
     </w:p>
     <w:p>

</xml_diff>